<commit_message>
added some bilets on oaip
</commit_message>
<xml_diff>
--- a/tmois/lab3/отчет_тмоис_3_пальчевский.docx
+++ b/tmois/lab3/отчет_тмоис_3_пальчевский.docx
@@ -1748,12 +1748,12 @@
             <wp:extent cx="2657475" cy="3114675"/>
             <wp:effectExtent b="0" l="0" r="0" t="0"/>
             <wp:wrapTopAndBottom distB="114300" distT="114300"/>
-            <wp:docPr id="2" name="image8.png"/>
+            <wp:docPr id="2" name="image6.png"/>
             <a:graphic>
               <a:graphicData uri="http://schemas.openxmlformats.org/drawingml/2006/picture">
                 <pic:pic>
                   <pic:nvPicPr>
-                    <pic:cNvPr id="0" name="image8.png"/>
+                    <pic:cNvPr id="0" name="image6.png"/>
                     <pic:cNvPicPr preferRelativeResize="0"/>
                   </pic:nvPicPr>
                   <pic:blipFill>
@@ -1790,12 +1790,12 @@
             <wp:extent cx="3095625" cy="6677025"/>
             <wp:effectExtent b="0" l="0" r="0" t="0"/>
             <wp:wrapTopAndBottom distB="114300" distT="114300"/>
-            <wp:docPr id="7" name="image14.png"/>
+            <wp:docPr id="7" name="image5.png"/>
             <a:graphic>
               <a:graphicData uri="http://schemas.openxmlformats.org/drawingml/2006/picture">
                 <pic:pic>
                   <pic:nvPicPr>
-                    <pic:cNvPr id="0" name="image14.png"/>
+                    <pic:cNvPr id="0" name="image5.png"/>
                     <pic:cNvPicPr preferRelativeResize="0"/>
                   </pic:nvPicPr>
                   <pic:blipFill>
@@ -2269,12 +2269,12 @@
             <wp:extent cx="2914650" cy="6657975"/>
             <wp:effectExtent b="0" l="0" r="0" t="0"/>
             <wp:wrapTopAndBottom distB="0" distT="0"/>
-            <wp:docPr id="6" name="image9.png"/>
+            <wp:docPr id="6" name="image12.png"/>
             <a:graphic>
               <a:graphicData uri="http://schemas.openxmlformats.org/drawingml/2006/picture">
                 <pic:pic>
                   <pic:nvPicPr>
-                    <pic:cNvPr id="0" name="image9.png"/>
+                    <pic:cNvPr id="0" name="image12.png"/>
                     <pic:cNvPicPr preferRelativeResize="0"/>
                   </pic:nvPicPr>
                   <pic:blipFill>
@@ -2311,12 +2311,12 @@
             <wp:extent cx="2800350" cy="2752725"/>
             <wp:effectExtent b="0" l="0" r="0" t="0"/>
             <wp:wrapTopAndBottom distB="0" distT="0"/>
-            <wp:docPr id="12" name="image3.png"/>
+            <wp:docPr id="12" name="image8.png"/>
             <a:graphic>
               <a:graphicData uri="http://schemas.openxmlformats.org/drawingml/2006/picture">
                 <pic:pic>
                   <pic:nvPicPr>
-                    <pic:cNvPr id="0" name="image3.png"/>
+                    <pic:cNvPr id="0" name="image8.png"/>
                     <pic:cNvPicPr preferRelativeResize="0"/>
                   </pic:nvPicPr>
                   <pic:blipFill>
@@ -2444,12 +2444,12 @@
           <wp:inline distB="114300" distT="114300" distL="114300" distR="114300">
             <wp:extent cx="4067175" cy="4476750"/>
             <wp:effectExtent b="0" l="0" r="0" t="0"/>
-            <wp:docPr id="14" name="image5.png"/>
+            <wp:docPr id="14" name="image9.png"/>
             <a:graphic>
               <a:graphicData uri="http://schemas.openxmlformats.org/drawingml/2006/picture">
                 <pic:pic>
                   <pic:nvPicPr>
-                    <pic:cNvPr id="0" name="image5.png"/>
+                    <pic:cNvPr id="0" name="image9.png"/>
                     <pic:cNvPicPr preferRelativeResize="0"/>
                   </pic:nvPicPr>
                   <pic:blipFill>
@@ -2941,12 +2941,12 @@
             <wp:extent cx="2428875" cy="6715125"/>
             <wp:effectExtent b="0" l="0" r="0" t="0"/>
             <wp:wrapTopAndBottom distB="114300" distT="114300"/>
-            <wp:docPr id="5" name="image4.png"/>
+            <wp:docPr id="5" name="image2.png"/>
             <a:graphic>
               <a:graphicData uri="http://schemas.openxmlformats.org/drawingml/2006/picture">
                 <pic:pic>
                   <pic:nvPicPr>
-                    <pic:cNvPr id="0" name="image4.png"/>
+                    <pic:cNvPr id="0" name="image2.png"/>
                     <pic:cNvPicPr preferRelativeResize="0"/>
                   </pic:nvPicPr>
                   <pic:blipFill>
@@ -3042,12 +3042,12 @@
           <wp:inline distB="114300" distT="114300" distL="114300" distR="114300">
             <wp:extent cx="3629025" cy="3886200"/>
             <wp:effectExtent b="0" l="0" r="0" t="0"/>
-            <wp:docPr id="1" name="image1.png"/>
+            <wp:docPr id="1" name="image14.png"/>
             <a:graphic>
               <a:graphicData uri="http://schemas.openxmlformats.org/drawingml/2006/picture">
                 <pic:pic>
                   <pic:nvPicPr>
-                    <pic:cNvPr id="0" name="image1.png"/>
+                    <pic:cNvPr id="0" name="image14.png"/>
                     <pic:cNvPicPr preferRelativeResize="0"/>
                   </pic:nvPicPr>
                   <pic:blipFill>
@@ -3666,12 +3666,12 @@
             <wp:extent cx="2543175" cy="6743700"/>
             <wp:effectExtent b="0" l="0" r="0" t="0"/>
             <wp:wrapTopAndBottom distB="114300" distT="114300"/>
-            <wp:docPr id="3" name="image13.png"/>
+            <wp:docPr id="3" name="image4.png"/>
             <a:graphic>
               <a:graphicData uri="http://schemas.openxmlformats.org/drawingml/2006/picture">
                 <pic:pic>
                   <pic:nvPicPr>
-                    <pic:cNvPr id="0" name="image13.png"/>
+                    <pic:cNvPr id="0" name="image4.png"/>
                     <pic:cNvPicPr preferRelativeResize="0"/>
                   </pic:nvPicPr>
                   <pic:blipFill>
@@ -3742,12 +3742,12 @@
           <wp:inline distB="114300" distT="114300" distL="114300" distR="114300">
             <wp:extent cx="4914900" cy="5038725"/>
             <wp:effectExtent b="0" l="0" r="0" t="0"/>
-            <wp:docPr id="8" name="image11.png"/>
+            <wp:docPr id="8" name="image3.png"/>
             <a:graphic>
               <a:graphicData uri="http://schemas.openxmlformats.org/drawingml/2006/picture">
                 <pic:pic>
                   <pic:nvPicPr>
-                    <pic:cNvPr id="0" name="image11.png"/>
+                    <pic:cNvPr id="0" name="image3.png"/>
                     <pic:cNvPicPr preferRelativeResize="0"/>
                   </pic:nvPicPr>
                   <pic:blipFill>
@@ -3798,12 +3798,12 @@
           <wp:inline distB="114300" distT="114300" distL="114300" distR="114300">
             <wp:extent cx="2828925" cy="6734175"/>
             <wp:effectExtent b="0" l="0" r="0" t="0"/>
-            <wp:docPr id="10" name="image10.png"/>
+            <wp:docPr id="10" name="image7.png"/>
             <a:graphic>
               <a:graphicData uri="http://schemas.openxmlformats.org/drawingml/2006/picture">
                 <pic:pic>
                   <pic:nvPicPr>
-                    <pic:cNvPr id="0" name="image10.png"/>
+                    <pic:cNvPr id="0" name="image7.png"/>
                     <pic:cNvPicPr preferRelativeResize="0"/>
                   </pic:nvPicPr>
                   <pic:blipFill>
@@ -3915,12 +3915,12 @@
           <wp:inline distB="114300" distT="114300" distL="114300" distR="114300">
             <wp:extent cx="4800713" cy="5949118"/>
             <wp:effectExtent b="0" l="0" r="0" t="0"/>
-            <wp:docPr id="11" name="image7.png"/>
+            <wp:docPr id="11" name="image1.png"/>
             <a:graphic>
               <a:graphicData uri="http://schemas.openxmlformats.org/drawingml/2006/picture">
                 <pic:pic>
                   <pic:nvPicPr>
-                    <pic:cNvPr id="0" name="image7.png"/>
+                    <pic:cNvPr id="0" name="image1.png"/>
                     <pic:cNvPicPr preferRelativeResize="0"/>
                   </pic:nvPicPr>
                   <pic:blipFill>
@@ -3975,12 +3975,12 @@
           <wp:inline distB="114300" distT="114300" distL="114300" distR="114300">
             <wp:extent cx="3352913" cy="6267602"/>
             <wp:effectExtent b="0" l="0" r="0" t="0"/>
-            <wp:docPr id="13" name="image6.png"/>
+            <wp:docPr id="13" name="image13.png"/>
             <a:graphic>
               <a:graphicData uri="http://schemas.openxmlformats.org/drawingml/2006/picture">
                 <pic:pic>
                   <pic:nvPicPr>
-                    <pic:cNvPr id="0" name="image6.png"/>
+                    <pic:cNvPr id="0" name="image13.png"/>
                     <pic:cNvPicPr preferRelativeResize="0"/>
                   </pic:nvPicPr>
                   <pic:blipFill>
@@ -4109,12 +4109,12 @@
           <wp:inline distB="114300" distT="114300" distL="114300" distR="114300">
             <wp:extent cx="2943225" cy="4772025"/>
             <wp:effectExtent b="0" l="0" r="0" t="0"/>
-            <wp:docPr id="4" name="image12.png"/>
+            <wp:docPr id="4" name="image11.png"/>
             <a:graphic>
               <a:graphicData uri="http://schemas.openxmlformats.org/drawingml/2006/picture">
                 <pic:pic>
                   <pic:nvPicPr>
-                    <pic:cNvPr id="0" name="image12.png"/>
+                    <pic:cNvPr id="0" name="image11.png"/>
                     <pic:cNvPicPr preferRelativeResize="0"/>
                   </pic:nvPicPr>
                   <pic:blipFill>
@@ -4165,12 +4165,12 @@
           <wp:inline distB="114300" distT="114300" distL="114300" distR="114300">
             <wp:extent cx="3295650" cy="6762750"/>
             <wp:effectExtent b="0" l="0" r="0" t="0"/>
-            <wp:docPr id="9" name="image2.png"/>
+            <wp:docPr id="9" name="image10.png"/>
             <a:graphic>
               <a:graphicData uri="http://schemas.openxmlformats.org/drawingml/2006/picture">
                 <pic:pic>
                   <pic:nvPicPr>
-                    <pic:cNvPr id="0" name="image2.png"/>
+                    <pic:cNvPr id="0" name="image10.png"/>
                     <pic:cNvPicPr preferRelativeResize="0"/>
                   </pic:nvPicPr>
                   <pic:blipFill>

</xml_diff>